<commit_message>
chore: new jobs found
</commit_message>
<xml_diff>
--- a/drafts/Hermès_CoverLetter.docx
+++ b/drafts/Hermès_CoverLetter.docx
@@ -59,7 +59,7 @@
         <w:br/>
         <w:t>Hermès</w:t>
         <w:br/>
-        <w:t>550 Madison Avenue</w:t>
+        <w:t>550 Madison Avenue, New York, NY</w:t>
       </w:r>
     </w:p>
     <w:p>
@@ -75,37 +75,52 @@
       </w:r>
     </w:p>
     <w:p>
-      <w:r>
-        <w:t>I am writing to express my strong interest in the Coordinator - Client Relations Center position at Hermès. With hands-on experience in marketing coordination, partnerships, and communications, I am excited by the opportunity to contribute to your commitment to craftsmanship and luxury brand excellence.</w:t>
-      </w:r>
-    </w:p>
-    <w:p>
-      <w:r>
-        <w:t>In my current role as Marketing &amp; Partnerships Assistant at The Paley Center for Media, I support the execution of integrated marketing campaigns and large-scale events, collaborating across internal teams and external partners to ensure seamless delivery. I coordinate marketing assets, manage timelines, and track deliverables across multiple campaigns while supporting partner activations and outreach efforts to expand reach and drive engagement. This experience has strengthened my ability to stay highly organized, communicate effectively, and execute projects in fast-paced, deadline-driven environments.</w:t>
-      </w:r>
-    </w:p>
-    <w:p>
-      <w:r>
-        <w:t>I have also developed a strong foundation in administrative support, where I have supported operational initiatives from planning through execution. I have experience coordinating logistics, which has strengthened my ability to manage multiple priorities while maintaining attention to detail and accuracy.</w:t>
-      </w:r>
-    </w:p>
-    <w:p>
-      <w:r>
-        <w:t>I am particularly drawn to Hermès because of its prestige and dedication to maintaining brand integrity across all touchpoints. I am eager to bring a proactive, collaborative approach and strong organizational skills to support your growth initiatives.</w:t>
-      </w:r>
-    </w:p>
-    <w:p>
-      <w:r>
-        <w:t>Thank you for your time and consideration. I would welcome the opportunity to further discuss how my experience and interests align with this role.</w:t>
-      </w:r>
-    </w:p>
-    <w:p>
+      <w:pPr>
+        <w:spacing w:after="240"/>
+      </w:pPr>
+      <w:r>
+        <w:t>I am writing to express my strong interest in the Special Events Coordinator position at Hermès. With hands-on experience in marketing coordination, partnerships, and communications, I am excited by the opportunity to contribute to your commitment to luxury craftsmanship and high-end hospitality.</w:t>
+      </w:r>
+    </w:p>
+    <w:p>
+      <w:pPr>
+        <w:spacing w:after="240"/>
+      </w:pPr>
+      <w:r>
+        <w:t xml:space="preserve"> events. </w:t>
+      </w:r>
+    </w:p>
+    <w:p>
+      <w:pPr>
+        <w:spacing w:after="240"/>
+      </w:pPr>
+      <w:r>
+        <w:t>In my current role as Marketing &amp; Partnerships Assistant at The Paley Center for Media, I support the execution of integrated marketing campaigns and large-scale events, collaborating across internal teams and external partners to ensure seamless delivery. This experience has strengthened my ability to stay highly organized, communicate effectively, and execute projects in fast-paced, deadline-driven environments. I have also developed a strong foundation in event production, where I have supported large-scale performances and member initiatives from planning through execution. This has honed my ability to manage multiple priorities while maintaining attention to detail and accuracy.</w:t>
+      </w:r>
+    </w:p>
+    <w:p>
+      <w:pPr>
+        <w:spacing w:after="240"/>
+      </w:pPr>
+      <w:r>
+        <w:t xml:space="preserve"> I am particularly drawn to Hermès because of your unparalleled reputation for aesthetic curation and luxury brand excellence. I am eager to bring a proactive, collaborative approach and strong organizational skills to support your growth initiatives.</w:t>
+      </w:r>
+    </w:p>
+    <w:p>
+      <w:pPr>
+        <w:spacing w:after="240"/>
+      </w:pPr>
+      <w:r>
+        <w:t xml:space="preserve"> Thank you for your time and consideration. I would welcome the opportunity to further discuss how my experience and interests align with this role.</w:t>
+      </w:r>
+    </w:p>
+    <w:p>
+      <w:pPr>
+        <w:spacing w:after="240"/>
+      </w:pPr>
       <w:r>
         <w:t>Sincerely,</w:t>
-      </w:r>
-    </w:p>
-    <w:p>
-      <w:r>
+        <w:br/>
         <w:t>Ava Aschettino</w:t>
       </w:r>
     </w:p>

</xml_diff>